<commit_message>
Actualizacion documento semana 6
</commit_message>
<xml_diff>
--- a/TALLERES/DOCUMENTACION SEMANA 6 - FINALCORTE1.docx
+++ b/TALLERES/DOCUMENTACION SEMANA 6 - FINALCORTE1.docx
@@ -3582,23 +3582,7 @@
           <w:sz w:val="22"/>
           <w:szCs w:val="22"/>
         </w:rPr>
-        <w:t>E</w:t>
-      </w:r>
-      <w:r>
-        <w:rPr>
-          <w:rFonts w:ascii="Arial" w:hAnsi="Arial" w:cs="Arial"/>
-          <w:sz w:val="22"/>
-          <w:szCs w:val="22"/>
-        </w:rPr>
-        <w:t>s la encargada de centralizar la configuración de seguridad del sistema, específicamente los parámetros utilizados para la generación y validación de los tokens JWT</w:t>
-      </w:r>
-      <w:r>
-        <w:rPr>
-          <w:rFonts w:ascii="Arial" w:hAnsi="Arial" w:cs="Arial"/>
-          <w:sz w:val="22"/>
-          <w:szCs w:val="22"/>
-        </w:rPr>
-        <w:t>,</w:t>
+        <w:t>Es la encargada de centralizar la configuración de seguridad del sistema, específicamente los parámetros utilizados para la generación y validación de los tokens JWT,</w:t>
       </w:r>
       <w:r>
         <w:rPr>
@@ -3614,15 +3598,7 @@
           <w:sz w:val="22"/>
           <w:szCs w:val="22"/>
         </w:rPr>
-        <w:t>e</w:t>
-      </w:r>
-      <w:r>
-        <w:rPr>
-          <w:rFonts w:ascii="Arial" w:hAnsi="Arial" w:cs="Arial"/>
-          <w:sz w:val="22"/>
-          <w:szCs w:val="22"/>
-        </w:rPr>
-        <w:t xml:space="preserve">n esta clase se cargan los valores definidos en el archivo </w:t>
+        <w:t xml:space="preserve">en esta clase se cargan los valores definidos en el archivo </w:t>
       </w:r>
       <w:r>
         <w:rPr>
@@ -3688,23 +3664,7 @@
           <w:sz w:val="22"/>
           <w:szCs w:val="22"/>
         </w:rPr>
-        <w:t>, lo que garantiza que exista una única instancia de esta configuración durante toda la ejecución de la aplicación</w:t>
-      </w:r>
-      <w:r>
-        <w:rPr>
-          <w:rFonts w:ascii="Arial" w:hAnsi="Arial" w:cs="Arial"/>
-          <w:sz w:val="22"/>
-          <w:szCs w:val="22"/>
-        </w:rPr>
-        <w:t>, d</w:t>
-      </w:r>
-      <w:r>
-        <w:rPr>
-          <w:rFonts w:ascii="Arial" w:hAnsi="Arial" w:cs="Arial"/>
-          <w:sz w:val="22"/>
-          <w:szCs w:val="22"/>
-        </w:rPr>
-        <w:t>e esta forma, todas las clases relacionadas con la seguridad acceden a la misma configuración, asegurando consistencia en el proceso de generación y validación de los tokens.</w:t>
+        <w:t>, lo que garantiza que exista una única instancia de esta configuración durante toda la ejecución de la aplicación, de esta forma, todas las clases relacionadas con la seguridad acceden a la misma configuración, asegurando consistencia en el proceso de generación y validación de los tokens.</w:t>
       </w:r>
     </w:p>
     <w:p>
@@ -5937,54 +5897,27 @@
           <w:szCs w:val="22"/>
           <w:lang w:eastAsia="es-ES"/>
         </w:rPr>
-        <w:t>Se encarga de u</w:t>
-      </w:r>
-      <w:r>
-        <w:rPr>
-          <w:rFonts w:ascii="Arial" w:hAnsi="Arial" w:cs="Arial"/>
+        <w:t xml:space="preserve">Esta clase utiliza el mecanismo de </w:t>
+      </w:r>
+      <w:r>
+        <w:rPr>
+          <w:rFonts w:ascii="Arial" w:hAnsi="Arial" w:cs="Arial"/>
+          <w:b/>
+          <w:bCs/>
           <w:sz w:val="22"/>
           <w:szCs w:val="22"/>
           <w:lang w:eastAsia="es-ES"/>
         </w:rPr>
-        <w:t xml:space="preserve">tiliza el mecanismo de </w:t>
-      </w:r>
-      <w:r>
-        <w:rPr>
-          <w:rFonts w:ascii="Arial" w:hAnsi="Arial" w:cs="Arial"/>
-          <w:b/>
-          <w:bCs/>
+        <w:t>reflexión</w:t>
+      </w:r>
+      <w:r>
+        <w:rPr>
+          <w:rFonts w:ascii="Arial" w:hAnsi="Arial" w:cs="Arial"/>
           <w:sz w:val="22"/>
           <w:szCs w:val="22"/>
           <w:lang w:eastAsia="es-ES"/>
         </w:rPr>
-        <w:t>reflexión</w:t>
-      </w:r>
-      <w:r>
-        <w:rPr>
-          <w:rFonts w:ascii="Arial" w:hAnsi="Arial" w:cs="Arial"/>
-          <w:sz w:val="22"/>
-          <w:szCs w:val="22"/>
-          <w:lang w:eastAsia="es-ES"/>
-        </w:rPr>
-        <w:t xml:space="preserve"> de Java para instanciar dinámicamente la clase correspondiente al tipo de rol solicitado</w:t>
-      </w:r>
-      <w:r>
-        <w:rPr>
-          <w:rFonts w:ascii="Arial" w:hAnsi="Arial" w:cs="Arial"/>
-          <w:sz w:val="22"/>
-          <w:szCs w:val="22"/>
-          <w:lang w:eastAsia="es-ES"/>
-        </w:rPr>
-        <w:t>, d</w:t>
-      </w:r>
-      <w:r>
-        <w:rPr>
-          <w:rFonts w:ascii="Arial" w:hAnsi="Arial" w:cs="Arial"/>
-          <w:sz w:val="22"/>
-          <w:szCs w:val="22"/>
-          <w:lang w:eastAsia="es-ES"/>
-        </w:rPr>
-        <w:t>e esta manera, la fábrica no depende de estructuras condicionales para decidir qué objeto crear, sino que delega la instanciación al mecanismo de reflexión.</w:t>
+        <w:t xml:space="preserve"> de Java para crear dinámicamente la instancia de la clase que corresponde al tipo de rol solicitado. Gracias a esto, la fábrica no necesita utilizar estructuras condicionales para determinar qué objeto debe crear, ya que la responsabilidad de la instanciación se delega al mecanismo de reflexión proporcionado por el lenguaje.</w:t>
       </w:r>
     </w:p>
     <w:p>
@@ -6220,17 +6153,27 @@
           <w:szCs w:val="22"/>
           <w:lang w:eastAsia="es-ES"/>
         </w:rPr>
-        <w:t xml:space="preserve">, la incorporación de nuevos roles ahora se realiza simplemente creando una nueva clase que herede de </w:t>
-      </w:r>
-      <w:r>
-        <w:rPr>
-          <w:rFonts w:ascii="Arial" w:hAnsi="Arial" w:cs="Arial"/>
-          <w:b/>
-          <w:bCs/>
+        <w:t xml:space="preserve">, la incorporación de nuevos roles ahora se realiza simplemente creando una </w:t>
+      </w:r>
+      <w:r>
+        <w:rPr>
+          <w:rFonts w:ascii="Arial" w:hAnsi="Arial" w:cs="Arial"/>
           <w:sz w:val="22"/>
           <w:szCs w:val="22"/>
           <w:lang w:eastAsia="es-ES"/>
         </w:rPr>
+        <w:lastRenderedPageBreak/>
+        <w:t xml:space="preserve">nueva clase que herede de </w:t>
+      </w:r>
+      <w:r>
+        <w:rPr>
+          <w:rFonts w:ascii="Arial" w:hAnsi="Arial" w:cs="Arial"/>
+          <w:b/>
+          <w:bCs/>
+          <w:sz w:val="22"/>
+          <w:szCs w:val="22"/>
+          <w:lang w:eastAsia="es-ES"/>
+        </w:rPr>
         <w:t>Rol</w:t>
       </w:r>
       <w:r>
@@ -6278,7 +6221,6 @@
         <w:rPr>
           <w:noProof/>
         </w:rPr>
-        <w:lastRenderedPageBreak/>
         <w:drawing>
           <wp:inline distT="0" distB="0" distL="0" distR="0" wp14:anchorId="1E62172D" wp14:editId="341FD897">
             <wp:extent cx="5400040" cy="2369820"/>
@@ -6522,7 +6464,6 @@
           <w:szCs w:val="22"/>
           <w:lang w:eastAsia="es-ES"/>
         </w:rPr>
-        <w:lastRenderedPageBreak/>
         <w:t>CrearRolUseCase</w:t>
       </w:r>
     </w:p>
@@ -6944,7 +6885,6 @@
           <w:sz w:val="22"/>
           <w:szCs w:val="22"/>
         </w:rPr>
-        <w:lastRenderedPageBreak/>
         <w:t>USUARIO</w:t>
       </w:r>
     </w:p>
@@ -7138,7 +7078,6 @@
           <w:sz w:val="28"/>
           <w:szCs w:val="28"/>
         </w:rPr>
-        <w:lastRenderedPageBreak/>
         <w:drawing>
           <wp:anchor distT="0" distB="0" distL="114300" distR="114300" simplePos="0" relativeHeight="251677696" behindDoc="0" locked="0" layoutInCell="1" allowOverlap="1" wp14:anchorId="52DE67D4" wp14:editId="5144375F">
             <wp:simplePos x="0" y="0"/>
@@ -7654,7 +7593,6 @@
           <w:b/>
           <w:bCs/>
         </w:rPr>
-        <w:lastRenderedPageBreak/>
         <w:t>IMPLEMENTACIÓN</w:t>
       </w:r>
     </w:p>
@@ -8282,7 +8220,6 @@
           <w:sz w:val="22"/>
           <w:szCs w:val="22"/>
         </w:rPr>
-        <w:lastRenderedPageBreak/>
         <w:t>AuditoriaSeguridadFactory</w:t>
       </w:r>
       <w:r>
@@ -11842,6 +11779,7 @@
           <w:rFonts w:ascii="Arial" w:hAnsi="Arial" w:cs="Arial"/>
           <w:b/>
           <w:bCs/>
+          <w:noProof/>
         </w:rPr>
         <w:drawing>
           <wp:inline distT="0" distB="0" distL="0" distR="0" wp14:anchorId="33C2FB42" wp14:editId="4988E84E">
@@ -11917,6 +11855,7 @@
           <w:rFonts w:ascii="Arial" w:hAnsi="Arial" w:cs="Arial"/>
           <w:b/>
           <w:bCs/>
+          <w:noProof/>
         </w:rPr>
         <w:drawing>
           <wp:anchor distT="0" distB="0" distL="114300" distR="114300" simplePos="0" relativeHeight="251705344" behindDoc="0" locked="0" layoutInCell="1" allowOverlap="1" wp14:anchorId="2AAA0E35" wp14:editId="63493BD7">
@@ -12053,6 +11992,7 @@
           <w:rFonts w:ascii="Arial" w:hAnsi="Arial" w:cs="Arial"/>
           <w:b/>
           <w:bCs/>
+          <w:noProof/>
         </w:rPr>
         <w:drawing>
           <wp:inline distT="0" distB="0" distL="0" distR="0" wp14:anchorId="79F4593E" wp14:editId="2F80BDC9">
@@ -12194,25 +12134,6 @@
           <w:sz w:val="22"/>
           <w:szCs w:val="22"/>
         </w:rPr>
-        <w:t xml:space="preserve">La aplicación de patrones de diseño creacionales como Singleton, Factory Method, Abstract Factory y Builder contribuyó a estructurar de forma más eficiente el proceso de creación de objetos dentro del sistema. </w:t>
-      </w:r>
-    </w:p>
-    <w:p>
-      <w:pPr>
-        <w:spacing w:line="360" w:lineRule="auto"/>
-        <w:jc w:val="both"/>
-        <w:rPr>
-          <w:rFonts w:ascii="Arial" w:hAnsi="Arial" w:cs="Arial"/>
-          <w:sz w:val="22"/>
-          <w:szCs w:val="22"/>
-        </w:rPr>
-      </w:pPr>
-      <w:r>
-        <w:rPr>
-          <w:rFonts w:ascii="Arial" w:hAnsi="Arial" w:cs="Arial"/>
-          <w:sz w:val="22"/>
-          <w:szCs w:val="22"/>
-        </w:rPr>
         <w:t>El patrón Singleton permitió centralizar la configuración de seguridad utilizada en la generación y validación de tokens JWT, garantizando una única instancia de configuración durante toda la ejecución del microservicio de identidad. Por su parte, el patrón Factory Method facilitó la creación controlada de los diferentes tipos de roles dentro del sistema de autorización, reduciendo el acoplamiento entre las clases y mejorando la extensibilidad del sistema.</w:t>
       </w:r>
     </w:p>
@@ -12329,43 +12250,7 @@
           <w:sz w:val="22"/>
           <w:szCs w:val="22"/>
         </w:rPr>
-        <w:t xml:space="preserve">Sánchez, G. (2025). Patrones de diseño y estrategias reutilizables en la automatización de pruebas de software con </w:t>
-      </w:r>
-      <w:proofErr w:type="spellStart"/>
-      <w:r>
-        <w:rPr>
-          <w:rFonts w:ascii="Arial" w:hAnsi="Arial" w:cs="Arial"/>
-          <w:sz w:val="22"/>
-          <w:szCs w:val="22"/>
-        </w:rPr>
-        <w:t>Selenium</w:t>
-      </w:r>
-      <w:proofErr w:type="spellEnd"/>
-      <w:r>
-        <w:rPr>
-          <w:rFonts w:ascii="Arial" w:hAnsi="Arial" w:cs="Arial"/>
-          <w:sz w:val="22"/>
-          <w:szCs w:val="22"/>
-        </w:rPr>
-        <w:t xml:space="preserve"> y Java–Page </w:t>
-      </w:r>
-      <w:proofErr w:type="spellStart"/>
-      <w:r>
-        <w:rPr>
-          <w:rFonts w:ascii="Arial" w:hAnsi="Arial" w:cs="Arial"/>
-          <w:sz w:val="22"/>
-          <w:szCs w:val="22"/>
-        </w:rPr>
-        <w:t>Object</w:t>
-      </w:r>
-      <w:proofErr w:type="spellEnd"/>
-      <w:r>
-        <w:rPr>
-          <w:rFonts w:ascii="Arial" w:hAnsi="Arial" w:cs="Arial"/>
-          <w:sz w:val="22"/>
-          <w:szCs w:val="22"/>
-        </w:rPr>
-        <w:t xml:space="preserve"> Model, Singleton, Factory y Fluent Interface. </w:t>
+        <w:t>Sánchez, G. (2025). Patrones de diseño y estrategias reutilizables en la automatización de pruebas de software con Selenium y Java–Page Object Model, Singleton, Factory y Fluent Interface. </w:t>
       </w:r>
       <w:r>
         <w:rPr>
@@ -12486,19 +12371,19 @@
           <w:szCs w:val="22"/>
           <w:lang w:val="en-US"/>
         </w:rPr>
-        <w:t xml:space="preserve">Berkeley, CA: </w:t>
-      </w:r>
-      <w:proofErr w:type="spellStart"/>
-      <w:r>
+        <w:t>Berkeley, CA: Apress.</w:t>
+      </w:r>
+    </w:p>
+    <w:p>
+      <w:pPr>
+        <w:jc w:val="both"/>
         <w:rPr>
           <w:rFonts w:ascii="Arial" w:hAnsi="Arial" w:cs="Arial"/>
           <w:sz w:val="22"/>
           <w:szCs w:val="22"/>
           <w:lang w:val="en-US"/>
         </w:rPr>
-        <w:t>Apress</w:t>
-      </w:r>
-      <w:proofErr w:type="spellEnd"/>
+      </w:pPr>
       <w:r>
         <w:rPr>
           <w:rFonts w:ascii="Arial" w:hAnsi="Arial" w:cs="Arial"/>
@@ -12506,38 +12391,17 @@
           <w:szCs w:val="22"/>
           <w:lang w:val="en-US"/>
         </w:rPr>
-        <w:t>.</w:t>
-      </w:r>
-    </w:p>
-    <w:p>
-      <w:pPr>
-        <w:jc w:val="both"/>
+        <w:t xml:space="preserve">Nahar, N., &amp; Sakib, K. (2015). Automatic Recommendation of Software Design Patterns Using Anti-patterns in the Design Phase: A Case Study on Abstract Factory. </w:t>
+      </w:r>
+      <w:r>
         <w:rPr>
           <w:rFonts w:ascii="Arial" w:hAnsi="Arial" w:cs="Arial"/>
           <w:sz w:val="22"/>
           <w:szCs w:val="22"/>
           <w:lang w:val="en-US"/>
         </w:rPr>
-      </w:pPr>
-      <w:r>
-        <w:rPr>
-          <w:rFonts w:ascii="Arial" w:hAnsi="Arial" w:cs="Arial"/>
-          <w:sz w:val="22"/>
-          <w:szCs w:val="22"/>
-          <w:lang w:val="en-US"/>
-        </w:rPr>
-        <w:t xml:space="preserve">Nahar, N., &amp; Sakib, K. (2015). Automatic Recommendation of Software Design Patterns Using Anti-patterns in the Design Phase: A Case Study on Abstract Factory. </w:t>
-      </w:r>
-      <w:r>
-        <w:rPr>
-          <w:rFonts w:ascii="Arial" w:hAnsi="Arial" w:cs="Arial"/>
-          <w:sz w:val="22"/>
-          <w:szCs w:val="22"/>
-          <w:lang w:val="en-US"/>
-        </w:rPr>
         <w:t>In </w:t>
       </w:r>
-      <w:proofErr w:type="spellStart"/>
       <w:r>
         <w:rPr>
           <w:rFonts w:ascii="Arial" w:hAnsi="Arial" w:cs="Arial"/>
@@ -12547,60 +12411,57 @@
           <w:szCs w:val="22"/>
           <w:lang w:val="en-US"/>
         </w:rPr>
-        <w:t>QuASoQ</w:t>
-      </w:r>
-      <w:proofErr w:type="spellEnd"/>
-      <w:r>
-        <w:rPr>
-          <w:rFonts w:ascii="Arial" w:hAnsi="Arial" w:cs="Arial"/>
-          <w:i/>
-          <w:iCs/>
+        <w:t>QuASoQ/WAWSE/CMCE@ APSEC</w:t>
+      </w:r>
+      <w:r>
+        <w:rPr>
+          <w:rFonts w:ascii="Arial" w:hAnsi="Arial" w:cs="Arial"/>
           <w:sz w:val="22"/>
           <w:szCs w:val="22"/>
           <w:lang w:val="en-US"/>
         </w:rPr>
-        <w:t>/WAWSE/CMCE@ APSEC</w:t>
-      </w:r>
-      <w:r>
+        <w:t> (pp. 9-16).</w:t>
+      </w:r>
+    </w:p>
+    <w:p>
+      <w:pPr>
+        <w:jc w:val="both"/>
         <w:rPr>
           <w:rFonts w:ascii="Arial" w:hAnsi="Arial" w:cs="Arial"/>
           <w:sz w:val="22"/>
           <w:szCs w:val="22"/>
           <w:lang w:val="en-US"/>
         </w:rPr>
-        <w:t> (pp. 9-16).</w:t>
-      </w:r>
-    </w:p>
-    <w:p>
-      <w:pPr>
-        <w:jc w:val="both"/>
+      </w:pPr>
+      <w:r>
         <w:rPr>
           <w:rFonts w:ascii="Arial" w:hAnsi="Arial" w:cs="Arial"/>
           <w:sz w:val="22"/>
           <w:szCs w:val="22"/>
           <w:lang w:val="en-US"/>
         </w:rPr>
-      </w:pPr>
-      <w:r>
+        <w:t>Design Patterns: Elements of Reusable Object-Oriented Software – Gamma et al., pp. 87-98.</w:t>
+      </w:r>
+    </w:p>
+    <w:p>
+      <w:pPr>
+        <w:jc w:val="both"/>
         <w:rPr>
           <w:rFonts w:ascii="Arial" w:hAnsi="Arial" w:cs="Arial"/>
           <w:sz w:val="22"/>
           <w:szCs w:val="22"/>
           <w:lang w:val="en-US"/>
         </w:rPr>
-        <w:t>Design Patterns: Elements of Reusable Object-Oriented Software – Gamma et al., pp. 87-98.</w:t>
-      </w:r>
-    </w:p>
-    <w:p>
-      <w:pPr>
-        <w:jc w:val="both"/>
+      </w:pPr>
+      <w:r>
         <w:rPr>
           <w:rFonts w:ascii="Arial" w:hAnsi="Arial" w:cs="Arial"/>
           <w:sz w:val="22"/>
           <w:szCs w:val="22"/>
           <w:lang w:val="en-US"/>
         </w:rPr>
-      </w:pPr>
+        <w:t>Freeman &amp; Robson (2020). Head First Design Patterns</w:t>
+      </w:r>
       <w:r>
         <w:rPr>
           <w:rFonts w:ascii="Arial" w:hAnsi="Arial" w:cs="Arial"/>
@@ -12608,38 +12469,39 @@
           <w:szCs w:val="22"/>
           <w:lang w:val="en-US"/>
         </w:rPr>
-        <w:t>Freeman &amp; Robson (2020). Head First Design Patterns</w:t>
-      </w:r>
-      <w:r>
+        <w:t>.</w:t>
+      </w:r>
+    </w:p>
+    <w:p>
+      <w:pPr>
+        <w:jc w:val="both"/>
         <w:rPr>
           <w:rFonts w:ascii="Arial" w:hAnsi="Arial" w:cs="Arial"/>
           <w:sz w:val="22"/>
           <w:szCs w:val="22"/>
           <w:lang w:val="en-US"/>
         </w:rPr>
-        <w:t>.</w:t>
-      </w:r>
-    </w:p>
-    <w:p>
-      <w:pPr>
-        <w:jc w:val="both"/>
+      </w:pPr>
+      <w:r>
         <w:rPr>
           <w:rFonts w:ascii="Arial" w:hAnsi="Arial" w:cs="Arial"/>
           <w:sz w:val="22"/>
           <w:szCs w:val="22"/>
           <w:lang w:val="en-US"/>
         </w:rPr>
-      </w:pPr>
-      <w:r>
+        <w:t xml:space="preserve">Gamma, E., Helm, R., Johnson, R., &amp; Vlissides, J. (1994). Design Patterns: Elements of Reusable Object-Oriented Software. Addison-Wesley. </w:t>
+      </w:r>
+    </w:p>
+    <w:p>
+      <w:pPr>
+        <w:jc w:val="both"/>
         <w:rPr>
           <w:rFonts w:ascii="Arial" w:hAnsi="Arial" w:cs="Arial"/>
           <w:sz w:val="22"/>
           <w:szCs w:val="22"/>
           <w:lang w:val="en-US"/>
         </w:rPr>
-        <w:t xml:space="preserve">Gamma, E., Helm, R., Johnson, R., &amp; </w:t>
-      </w:r>
-      <w:proofErr w:type="spellStart"/>
+      </w:pPr>
       <w:r>
         <w:rPr>
           <w:rFonts w:ascii="Arial" w:hAnsi="Arial" w:cs="Arial"/>
@@ -12647,57 +12509,7 @@
           <w:szCs w:val="22"/>
           <w:lang w:val="en-US"/>
         </w:rPr>
-        <w:t>Vlissides</w:t>
-      </w:r>
-      <w:proofErr w:type="spellEnd"/>
-      <w:r>
-        <w:rPr>
-          <w:rFonts w:ascii="Arial" w:hAnsi="Arial" w:cs="Arial"/>
-          <w:sz w:val="22"/>
-          <w:szCs w:val="22"/>
-          <w:lang w:val="en-US"/>
-        </w:rPr>
-        <w:t xml:space="preserve">, J. (1994). Design Patterns: Elements of Reusable Object-Oriented Software. Addison-Wesley. </w:t>
-      </w:r>
-    </w:p>
-    <w:p>
-      <w:pPr>
-        <w:jc w:val="both"/>
-        <w:rPr>
-          <w:rFonts w:ascii="Arial" w:hAnsi="Arial" w:cs="Arial"/>
-          <w:sz w:val="22"/>
-          <w:szCs w:val="22"/>
-          <w:lang w:val="en-US"/>
-        </w:rPr>
-      </w:pPr>
-      <w:r>
-        <w:rPr>
-          <w:rFonts w:ascii="Arial" w:hAnsi="Arial" w:cs="Arial"/>
-          <w:sz w:val="22"/>
-          <w:szCs w:val="22"/>
-          <w:lang w:val="en-US"/>
-        </w:rPr>
-        <w:t xml:space="preserve">Bloch, J. (2018). Effective Java (3rd ed.). Addison-Wesley. (Item 2: Consider a </w:t>
-      </w:r>
-      <w:proofErr w:type="gramStart"/>
-      <w:r>
-        <w:rPr>
-          <w:rFonts w:ascii="Arial" w:hAnsi="Arial" w:cs="Arial"/>
-          <w:sz w:val="22"/>
-          <w:szCs w:val="22"/>
-          <w:lang w:val="en-US"/>
-        </w:rPr>
-        <w:t>Builder</w:t>
-      </w:r>
-      <w:proofErr w:type="gramEnd"/>
-      <w:r>
-        <w:rPr>
-          <w:rFonts w:ascii="Arial" w:hAnsi="Arial" w:cs="Arial"/>
-          <w:sz w:val="22"/>
-          <w:szCs w:val="22"/>
-          <w:lang w:val="en-US"/>
-        </w:rPr>
-        <w:t xml:space="preserve"> when faced with many constructor parameters).</w:t>
+        <w:t>Bloch, J. (2018). Effective Java (3rd ed.). Addison-Wesley. (Item 2: Consider a Builder when faced with many constructor parameters).</w:t>
       </w:r>
     </w:p>
     <w:sectPr>
@@ -14777,15 +14589,6 @@
   </w:num>
   <w:num w:numId="12" w16cid:durableId="1413431988">
     <w:abstractNumId w:val="3"/>
-    <w:lvlOverride w:ilvl="0"/>
-    <w:lvlOverride w:ilvl="1"/>
-    <w:lvlOverride w:ilvl="2"/>
-    <w:lvlOverride w:ilvl="3"/>
-    <w:lvlOverride w:ilvl="4"/>
-    <w:lvlOverride w:ilvl="5"/>
-    <w:lvlOverride w:ilvl="6"/>
-    <w:lvlOverride w:ilvl="7"/>
-    <w:lvlOverride w:ilvl="8"/>
   </w:num>
 </w:numbering>
 </file>
@@ -15392,6 +15195,7 @@
   <w:style w:type="character" w:default="1" w:styleId="Fuentedeprrafopredeter">
     <w:name w:val="Default Paragraph Font"/>
     <w:uiPriority w:val="1"/>
+    <w:semiHidden/>
     <w:unhideWhenUsed/>
   </w:style>
   <w:style w:type="table" w:default="1" w:styleId="Tablanormal">

</xml_diff>